<commit_message>
docs: proposta atualizada para a arquitetura com Javalin e Svelte
O resumo, a linha de encapsulamento e interfaces e a seção de tecnologias ainda descreviam a interface em Swing da versão 1.0.
</commit_message>
<xml_diff>
--- a/docs/Proposta_Projeto_Canteiro.docx
+++ b/docs/Proposta_Projeto_Canteiro.docx
@@ -630,7 +630,7 @@
           <w:sz w:val="20"/>
           <w:szCs w:val="20"/>
         </w:rPr>
-        <w:t xml:space="preserve">O jogo terá interface gráfica em Java, com tela de menu, seleção de dificuldade, partida, tela de colapso e ranking persistente de pontuações. Estão previstos ainda um modo "obra" com metas por fase e um sistema de repetição que permite rever a partida jogada por jogada.</w:t>
+        <w:t xml:space="preserve">As regras do jogo serão escritas em Java e a interface rodará no navegador, em Svelte com TypeScript, tudo na máquina do jogador. Haverá tela de menu, seleção de dificuldade, partida, tela de colapso e ranking persistente de pontuações. Estão previstos ainda um modo "obra" com metas por fase e um sistema de repetição que permite rever a partida jogada por jogada.</w:t>
       </w:r>
     </w:p>
     <w:p>
@@ -1290,7 +1290,7 @@
                 <w:sz w:val="19"/>
                 <w:szCs w:val="19"/>
               </w:rPr>
-              <w:t xml:space="preserve">Separação entre modelo, visualização e controle; interfaces comuns para os elementos desenháveis e atualizáveis a cada quadro.</w:t>
+              <w:t xml:space="preserve">Separação entre modelo, controle e interface; interfaces comuns para os observadores do estado e os elementos atualizáveis a cada ciclo.</w:t>
             </w:r>
           </w:p>
         </w:tc>
@@ -1339,7 +1339,7 @@
           <w:sz w:val="20"/>
           <w:szCs w:val="20"/>
         </w:rPr>
-        <w:t xml:space="preserve">Java 17. </w:t>
+        <w:t xml:space="preserve">Java 17 no backend, com Javalin (HTTP e WebSocket), e TypeScript no frontend. </w:t>
       </w:r>
       <w:r>
         <w:rPr>
@@ -1357,7 +1357,7 @@
           <w:sz w:val="20"/>
           <w:szCs w:val="20"/>
         </w:rPr>
-        <w:t xml:space="preserve">Swing, com desenho personalizado em componente próprio e laço de atualização controlado por temporizador. </w:t>
+        <w:t xml:space="preserve">Svelte 5 no navegador, com o tabuleiro desenhado em Canvas; o estado da partida chega do backend por WebSocket. </w:t>
       </w:r>
       <w:r>
         <w:rPr>
@@ -1393,7 +1393,7 @@
           <w:sz w:val="20"/>
           <w:szCs w:val="20"/>
         </w:rPr>
-        <w:t xml:space="preserve">JUnit para as regras de colisão, rotação e cálculo do centro de massa. </w:t>
+        <w:t xml:space="preserve">JUnit para colisão, rotação e centro de massa; Vitest para a interface. </w:t>
       </w:r>
       <w:r>
         <w:rPr>
@@ -1429,7 +1429,7 @@
           <w:sz w:val="20"/>
           <w:szCs w:val="20"/>
         </w:rPr>
-        <w:t xml:space="preserve">padrão MVC, separando as regras do jogo da camada gráfica.</w:t>
+        <w:t xml:space="preserve">cliente-servidor local (127.0.0.1), com todas as regras no backend e a interface só desenhando o estado; entregue como um único JAR.</w:t>
       </w:r>
     </w:p>
     <w:p>

</xml_diff>

<commit_message>
docs: tira matrícula e papel principal da tabela de integrantes da proposta
</commit_message>
<xml_diff>
--- a/docs/Proposta_Projeto_Canteiro.docx
+++ b/docs/Proposta_Projeto_Canteiro.docx
@@ -110,9 +110,7 @@
         </w:tblBorders>
       </w:tblPr>
       <w:tblGrid>
-        <w:gridCol w:w="3400"/>
-        <w:gridCol w:w="1500"/>
-        <w:gridCol w:w="4460"/>
+        <w:gridCol w:w="9360"/>
       </w:tblGrid>
       <w:tr>
         <w:trPr>
@@ -120,7 +118,7 @@
         </w:trPr>
         <w:tc>
           <w:tcPr>
-            <w:tcW w:type="dxa" w:w="3400"/>
+            <w:tcW w:type="dxa" w:w="9360"/>
             <w:shd w:fill="1F3864" w:color="auto" w:val="clear"/>
             <w:tcMar>
               <w:top w:type="dxa" w:w="60"/>
@@ -147,64 +145,6 @@
             </w:r>
           </w:p>
         </w:tc>
-        <w:tc>
-          <w:tcPr>
-            <w:tcW w:type="dxa" w:w="1500"/>
-            <w:shd w:fill="1F3864" w:color="auto" w:val="clear"/>
-            <w:tcMar>
-              <w:top w:type="dxa" w:w="60"/>
-              <w:left w:type="dxa" w:w="100"/>
-              <w:bottom w:type="dxa" w:w="60"/>
-              <w:right w:type="dxa" w:w="100"/>
-            </w:tcMar>
-          </w:tcPr>
-          <w:p>
-            <w:pPr>
-              <w:spacing w:after="0" w:line="240"/>
-              <w:jc w:val="left"/>
-            </w:pPr>
-            <w:r>
-              <w:rPr>
-                <w:rFonts w:ascii="Calibri" w:cs="Calibri" w:eastAsia="Calibri" w:hAnsi="Calibri"/>
-                <w:b/>
-                <w:bCs/>
-                <w:color w:val="FFFFFF"/>
-                <w:sz w:val="19"/>
-                <w:szCs w:val="19"/>
-              </w:rPr>
-              <w:t xml:space="preserve">Matrícula</w:t>
-            </w:r>
-          </w:p>
-        </w:tc>
-        <w:tc>
-          <w:tcPr>
-            <w:tcW w:type="dxa" w:w="4460"/>
-            <w:shd w:fill="1F3864" w:color="auto" w:val="clear"/>
-            <w:tcMar>
-              <w:top w:type="dxa" w:w="60"/>
-              <w:left w:type="dxa" w:w="100"/>
-              <w:bottom w:type="dxa" w:w="60"/>
-              <w:right w:type="dxa" w:w="100"/>
-            </w:tcMar>
-          </w:tcPr>
-          <w:p>
-            <w:pPr>
-              <w:spacing w:after="0" w:line="240"/>
-              <w:jc w:val="left"/>
-            </w:pPr>
-            <w:r>
-              <w:rPr>
-                <w:rFonts w:ascii="Calibri" w:cs="Calibri" w:eastAsia="Calibri" w:hAnsi="Calibri"/>
-                <w:b/>
-                <w:bCs/>
-                <w:color w:val="FFFFFF"/>
-                <w:sz w:val="19"/>
-                <w:szCs w:val="19"/>
-              </w:rPr>
-              <w:t xml:space="preserve">Papel principal nesta etapa</w:t>
-            </w:r>
-          </w:p>
-        </w:tc>
       </w:tr>
       <w:tr>
         <w:trPr>
@@ -212,7 +152,7 @@
         </w:trPr>
         <w:tc>
           <w:tcPr>
-            <w:tcW w:type="dxa" w:w="3400"/>
+            <w:tcW w:type="dxa" w:w="9360"/>
             <w:tcMar>
               <w:top w:type="dxa" w:w="60"/>
               <w:left w:type="dxa" w:w="100"/>
@@ -238,9 +178,15 @@
             </w:r>
           </w:p>
         </w:tc>
-        <w:tc>
-          <w:tcPr>
-            <w:tcW w:type="dxa" w:w="1500"/>
+      </w:tr>
+      <w:tr>
+        <w:trPr>
+          <w:tblHeader w:val="false"/>
+        </w:trPr>
+        <w:tc>
+          <w:tcPr>
+            <w:tcW w:type="dxa" w:w="9360"/>
+            <w:shd w:fill="F2F2F2" w:color="auto" w:val="clear"/>
             <w:tcMar>
               <w:top w:type="dxa" w:w="60"/>
               <w:left w:type="dxa" w:w="100"/>
@@ -262,13 +208,18 @@
                 <w:sz w:val="19"/>
                 <w:szCs w:val="19"/>
               </w:rPr>
-              <w:t xml:space="preserve"/>
-            </w:r>
-          </w:p>
-        </w:tc>
-        <w:tc>
-          <w:tcPr>
-            <w:tcW w:type="dxa" w:w="4460"/>
+              <w:t xml:space="preserve">Marcelo Camillo De Paula Leite</w:t>
+            </w:r>
+          </w:p>
+        </w:tc>
+      </w:tr>
+      <w:tr>
+        <w:trPr>
+          <w:tblHeader w:val="false"/>
+        </w:trPr>
+        <w:tc>
+          <w:tcPr>
+            <w:tcW w:type="dxa" w:w="9360"/>
             <w:tcMar>
               <w:top w:type="dxa" w:w="60"/>
               <w:left w:type="dxa" w:w="100"/>
@@ -290,188 +241,7 @@
                 <w:sz w:val="19"/>
                 <w:szCs w:val="19"/>
               </w:rPr>
-              <w:t xml:space="preserve"/>
-            </w:r>
-          </w:p>
-        </w:tc>
-      </w:tr>
-      <w:tr>
-        <w:trPr>
-          <w:tblHeader w:val="false"/>
-        </w:trPr>
-        <w:tc>
-          <w:tcPr>
-            <w:tcW w:type="dxa" w:w="3400"/>
-            <w:shd w:fill="F2F2F2" w:color="auto" w:val="clear"/>
-            <w:tcMar>
-              <w:top w:type="dxa" w:w="60"/>
-              <w:left w:type="dxa" w:w="100"/>
-              <w:bottom w:type="dxa" w:w="60"/>
-              <w:right w:type="dxa" w:w="100"/>
-            </w:tcMar>
-          </w:tcPr>
-          <w:p>
-            <w:pPr>
-              <w:spacing w:after="0" w:line="240"/>
-              <w:jc w:val="left"/>
-            </w:pPr>
-            <w:r>
-              <w:rPr>
-                <w:rFonts w:ascii="Calibri" w:cs="Calibri" w:eastAsia="Calibri" w:hAnsi="Calibri"/>
-                <w:b w:val="false"/>
-                <w:bCs w:val="false"/>
-                <w:color w:val="000000"/>
-                <w:sz w:val="19"/>
-                <w:szCs w:val="19"/>
-              </w:rPr>
-              <w:t xml:space="preserve">Marcelo Camillo De Paula Leite</w:t>
-            </w:r>
-          </w:p>
-        </w:tc>
-        <w:tc>
-          <w:tcPr>
-            <w:tcW w:type="dxa" w:w="1500"/>
-            <w:shd w:fill="F2F2F2" w:color="auto" w:val="clear"/>
-            <w:tcMar>
-              <w:top w:type="dxa" w:w="60"/>
-              <w:left w:type="dxa" w:w="100"/>
-              <w:bottom w:type="dxa" w:w="60"/>
-              <w:right w:type="dxa" w:w="100"/>
-            </w:tcMar>
-          </w:tcPr>
-          <w:p>
-            <w:pPr>
-              <w:spacing w:after="0" w:line="240"/>
-              <w:jc w:val="left"/>
-            </w:pPr>
-            <w:r>
-              <w:rPr>
-                <w:rFonts w:ascii="Calibri" w:cs="Calibri" w:eastAsia="Calibri" w:hAnsi="Calibri"/>
-                <w:b w:val="false"/>
-                <w:bCs w:val="false"/>
-                <w:color w:val="000000"/>
-                <w:sz w:val="19"/>
-                <w:szCs w:val="19"/>
-              </w:rPr>
-              <w:t xml:space="preserve"/>
-            </w:r>
-          </w:p>
-        </w:tc>
-        <w:tc>
-          <w:tcPr>
-            <w:tcW w:type="dxa" w:w="4460"/>
-            <w:shd w:fill="F2F2F2" w:color="auto" w:val="clear"/>
-            <w:tcMar>
-              <w:top w:type="dxa" w:w="60"/>
-              <w:left w:type="dxa" w:w="100"/>
-              <w:bottom w:type="dxa" w:w="60"/>
-              <w:right w:type="dxa" w:w="100"/>
-            </w:tcMar>
-          </w:tcPr>
-          <w:p>
-            <w:pPr>
-              <w:spacing w:after="0" w:line="240"/>
-              <w:jc w:val="left"/>
-            </w:pPr>
-            <w:r>
-              <w:rPr>
-                <w:rFonts w:ascii="Calibri" w:cs="Calibri" w:eastAsia="Calibri" w:hAnsi="Calibri"/>
-                <w:b w:val="false"/>
-                <w:bCs w:val="false"/>
-                <w:color w:val="000000"/>
-                <w:sz w:val="19"/>
-                <w:szCs w:val="19"/>
-              </w:rPr>
-              <w:t xml:space="preserve"/>
-            </w:r>
-          </w:p>
-        </w:tc>
-      </w:tr>
-      <w:tr>
-        <w:trPr>
-          <w:tblHeader w:val="false"/>
-        </w:trPr>
-        <w:tc>
-          <w:tcPr>
-            <w:tcW w:type="dxa" w:w="3400"/>
-            <w:tcMar>
-              <w:top w:type="dxa" w:w="60"/>
-              <w:left w:type="dxa" w:w="100"/>
-              <w:bottom w:type="dxa" w:w="60"/>
-              <w:right w:type="dxa" w:w="100"/>
-            </w:tcMar>
-          </w:tcPr>
-          <w:p>
-            <w:pPr>
-              <w:spacing w:after="0" w:line="240"/>
-              <w:jc w:val="left"/>
-            </w:pPr>
-            <w:r>
-              <w:rPr>
-                <w:rFonts w:ascii="Calibri" w:cs="Calibri" w:eastAsia="Calibri" w:hAnsi="Calibri"/>
-                <w:b w:val="false"/>
-                <w:bCs w:val="false"/>
-                <w:color w:val="000000"/>
-                <w:sz w:val="19"/>
-                <w:szCs w:val="19"/>
-              </w:rPr>
               <w:t xml:space="preserve">Wanessa Kylie Silva Medeiros</w:t>
-            </w:r>
-          </w:p>
-        </w:tc>
-        <w:tc>
-          <w:tcPr>
-            <w:tcW w:type="dxa" w:w="1500"/>
-            <w:tcMar>
-              <w:top w:type="dxa" w:w="60"/>
-              <w:left w:type="dxa" w:w="100"/>
-              <w:bottom w:type="dxa" w:w="60"/>
-              <w:right w:type="dxa" w:w="100"/>
-            </w:tcMar>
-          </w:tcPr>
-          <w:p>
-            <w:pPr>
-              <w:spacing w:after="0" w:line="240"/>
-              <w:jc w:val="left"/>
-            </w:pPr>
-            <w:r>
-              <w:rPr>
-                <w:rFonts w:ascii="Calibri" w:cs="Calibri" w:eastAsia="Calibri" w:hAnsi="Calibri"/>
-                <w:b w:val="false"/>
-                <w:bCs w:val="false"/>
-                <w:color w:val="000000"/>
-                <w:sz w:val="19"/>
-                <w:szCs w:val="19"/>
-              </w:rPr>
-              <w:t xml:space="preserve"/>
-            </w:r>
-          </w:p>
-        </w:tc>
-        <w:tc>
-          <w:tcPr>
-            <w:tcW w:type="dxa" w:w="4460"/>
-            <w:tcMar>
-              <w:top w:type="dxa" w:w="60"/>
-              <w:left w:type="dxa" w:w="100"/>
-              <w:bottom w:type="dxa" w:w="60"/>
-              <w:right w:type="dxa" w:w="100"/>
-            </w:tcMar>
-          </w:tcPr>
-          <w:p>
-            <w:pPr>
-              <w:spacing w:after="0" w:line="240"/>
-              <w:jc w:val="left"/>
-            </w:pPr>
-            <w:r>
-              <w:rPr>
-                <w:rFonts w:ascii="Calibri" w:cs="Calibri" w:eastAsia="Calibri" w:hAnsi="Calibri"/>
-                <w:b w:val="false"/>
-                <w:bCs w:val="false"/>
-                <w:color w:val="000000"/>
-                <w:sz w:val="19"/>
-                <w:szCs w:val="19"/>
-              </w:rPr>
-              <w:t xml:space="preserve"/>
             </w:r>
           </w:p>
         </w:tc>

</xml_diff>

<commit_message>
docs: tira matrícula e papel principal da tabela de integrantes da proposta (#6)
</commit_message>
<xml_diff>
--- a/docs/Proposta_Projeto_Canteiro.docx
+++ b/docs/Proposta_Projeto_Canteiro.docx
@@ -110,9 +110,7 @@
         </w:tblBorders>
       </w:tblPr>
       <w:tblGrid>
-        <w:gridCol w:w="3400"/>
-        <w:gridCol w:w="1500"/>
-        <w:gridCol w:w="4460"/>
+        <w:gridCol w:w="9360"/>
       </w:tblGrid>
       <w:tr>
         <w:trPr>
@@ -120,7 +118,7 @@
         </w:trPr>
         <w:tc>
           <w:tcPr>
-            <w:tcW w:type="dxa" w:w="3400"/>
+            <w:tcW w:type="dxa" w:w="9360"/>
             <w:shd w:fill="1F3864" w:color="auto" w:val="clear"/>
             <w:tcMar>
               <w:top w:type="dxa" w:w="60"/>
@@ -147,64 +145,6 @@
             </w:r>
           </w:p>
         </w:tc>
-        <w:tc>
-          <w:tcPr>
-            <w:tcW w:type="dxa" w:w="1500"/>
-            <w:shd w:fill="1F3864" w:color="auto" w:val="clear"/>
-            <w:tcMar>
-              <w:top w:type="dxa" w:w="60"/>
-              <w:left w:type="dxa" w:w="100"/>
-              <w:bottom w:type="dxa" w:w="60"/>
-              <w:right w:type="dxa" w:w="100"/>
-            </w:tcMar>
-          </w:tcPr>
-          <w:p>
-            <w:pPr>
-              <w:spacing w:after="0" w:line="240"/>
-              <w:jc w:val="left"/>
-            </w:pPr>
-            <w:r>
-              <w:rPr>
-                <w:rFonts w:ascii="Calibri" w:cs="Calibri" w:eastAsia="Calibri" w:hAnsi="Calibri"/>
-                <w:b/>
-                <w:bCs/>
-                <w:color w:val="FFFFFF"/>
-                <w:sz w:val="19"/>
-                <w:szCs w:val="19"/>
-              </w:rPr>
-              <w:t xml:space="preserve">Matrícula</w:t>
-            </w:r>
-          </w:p>
-        </w:tc>
-        <w:tc>
-          <w:tcPr>
-            <w:tcW w:type="dxa" w:w="4460"/>
-            <w:shd w:fill="1F3864" w:color="auto" w:val="clear"/>
-            <w:tcMar>
-              <w:top w:type="dxa" w:w="60"/>
-              <w:left w:type="dxa" w:w="100"/>
-              <w:bottom w:type="dxa" w:w="60"/>
-              <w:right w:type="dxa" w:w="100"/>
-            </w:tcMar>
-          </w:tcPr>
-          <w:p>
-            <w:pPr>
-              <w:spacing w:after="0" w:line="240"/>
-              <w:jc w:val="left"/>
-            </w:pPr>
-            <w:r>
-              <w:rPr>
-                <w:rFonts w:ascii="Calibri" w:cs="Calibri" w:eastAsia="Calibri" w:hAnsi="Calibri"/>
-                <w:b/>
-                <w:bCs/>
-                <w:color w:val="FFFFFF"/>
-                <w:sz w:val="19"/>
-                <w:szCs w:val="19"/>
-              </w:rPr>
-              <w:t xml:space="preserve">Papel principal nesta etapa</w:t>
-            </w:r>
-          </w:p>
-        </w:tc>
       </w:tr>
       <w:tr>
         <w:trPr>
@@ -212,7 +152,7 @@
         </w:trPr>
         <w:tc>
           <w:tcPr>
-            <w:tcW w:type="dxa" w:w="3400"/>
+            <w:tcW w:type="dxa" w:w="9360"/>
             <w:tcMar>
               <w:top w:type="dxa" w:w="60"/>
               <w:left w:type="dxa" w:w="100"/>
@@ -238,9 +178,15 @@
             </w:r>
           </w:p>
         </w:tc>
-        <w:tc>
-          <w:tcPr>
-            <w:tcW w:type="dxa" w:w="1500"/>
+      </w:tr>
+      <w:tr>
+        <w:trPr>
+          <w:tblHeader w:val="false"/>
+        </w:trPr>
+        <w:tc>
+          <w:tcPr>
+            <w:tcW w:type="dxa" w:w="9360"/>
+            <w:shd w:fill="F2F2F2" w:color="auto" w:val="clear"/>
             <w:tcMar>
               <w:top w:type="dxa" w:w="60"/>
               <w:left w:type="dxa" w:w="100"/>
@@ -262,13 +208,18 @@
                 <w:sz w:val="19"/>
                 <w:szCs w:val="19"/>
               </w:rPr>
-              <w:t xml:space="preserve"/>
-            </w:r>
-          </w:p>
-        </w:tc>
-        <w:tc>
-          <w:tcPr>
-            <w:tcW w:type="dxa" w:w="4460"/>
+              <w:t xml:space="preserve">Marcelo Camillo De Paula Leite</w:t>
+            </w:r>
+          </w:p>
+        </w:tc>
+      </w:tr>
+      <w:tr>
+        <w:trPr>
+          <w:tblHeader w:val="false"/>
+        </w:trPr>
+        <w:tc>
+          <w:tcPr>
+            <w:tcW w:type="dxa" w:w="9360"/>
             <w:tcMar>
               <w:top w:type="dxa" w:w="60"/>
               <w:left w:type="dxa" w:w="100"/>
@@ -290,188 +241,7 @@
                 <w:sz w:val="19"/>
                 <w:szCs w:val="19"/>
               </w:rPr>
-              <w:t xml:space="preserve"/>
-            </w:r>
-          </w:p>
-        </w:tc>
-      </w:tr>
-      <w:tr>
-        <w:trPr>
-          <w:tblHeader w:val="false"/>
-        </w:trPr>
-        <w:tc>
-          <w:tcPr>
-            <w:tcW w:type="dxa" w:w="3400"/>
-            <w:shd w:fill="F2F2F2" w:color="auto" w:val="clear"/>
-            <w:tcMar>
-              <w:top w:type="dxa" w:w="60"/>
-              <w:left w:type="dxa" w:w="100"/>
-              <w:bottom w:type="dxa" w:w="60"/>
-              <w:right w:type="dxa" w:w="100"/>
-            </w:tcMar>
-          </w:tcPr>
-          <w:p>
-            <w:pPr>
-              <w:spacing w:after="0" w:line="240"/>
-              <w:jc w:val="left"/>
-            </w:pPr>
-            <w:r>
-              <w:rPr>
-                <w:rFonts w:ascii="Calibri" w:cs="Calibri" w:eastAsia="Calibri" w:hAnsi="Calibri"/>
-                <w:b w:val="false"/>
-                <w:bCs w:val="false"/>
-                <w:color w:val="000000"/>
-                <w:sz w:val="19"/>
-                <w:szCs w:val="19"/>
-              </w:rPr>
-              <w:t xml:space="preserve">Marcelo Camillo De Paula Leite</w:t>
-            </w:r>
-          </w:p>
-        </w:tc>
-        <w:tc>
-          <w:tcPr>
-            <w:tcW w:type="dxa" w:w="1500"/>
-            <w:shd w:fill="F2F2F2" w:color="auto" w:val="clear"/>
-            <w:tcMar>
-              <w:top w:type="dxa" w:w="60"/>
-              <w:left w:type="dxa" w:w="100"/>
-              <w:bottom w:type="dxa" w:w="60"/>
-              <w:right w:type="dxa" w:w="100"/>
-            </w:tcMar>
-          </w:tcPr>
-          <w:p>
-            <w:pPr>
-              <w:spacing w:after="0" w:line="240"/>
-              <w:jc w:val="left"/>
-            </w:pPr>
-            <w:r>
-              <w:rPr>
-                <w:rFonts w:ascii="Calibri" w:cs="Calibri" w:eastAsia="Calibri" w:hAnsi="Calibri"/>
-                <w:b w:val="false"/>
-                <w:bCs w:val="false"/>
-                <w:color w:val="000000"/>
-                <w:sz w:val="19"/>
-                <w:szCs w:val="19"/>
-              </w:rPr>
-              <w:t xml:space="preserve"/>
-            </w:r>
-          </w:p>
-        </w:tc>
-        <w:tc>
-          <w:tcPr>
-            <w:tcW w:type="dxa" w:w="4460"/>
-            <w:shd w:fill="F2F2F2" w:color="auto" w:val="clear"/>
-            <w:tcMar>
-              <w:top w:type="dxa" w:w="60"/>
-              <w:left w:type="dxa" w:w="100"/>
-              <w:bottom w:type="dxa" w:w="60"/>
-              <w:right w:type="dxa" w:w="100"/>
-            </w:tcMar>
-          </w:tcPr>
-          <w:p>
-            <w:pPr>
-              <w:spacing w:after="0" w:line="240"/>
-              <w:jc w:val="left"/>
-            </w:pPr>
-            <w:r>
-              <w:rPr>
-                <w:rFonts w:ascii="Calibri" w:cs="Calibri" w:eastAsia="Calibri" w:hAnsi="Calibri"/>
-                <w:b w:val="false"/>
-                <w:bCs w:val="false"/>
-                <w:color w:val="000000"/>
-                <w:sz w:val="19"/>
-                <w:szCs w:val="19"/>
-              </w:rPr>
-              <w:t xml:space="preserve"/>
-            </w:r>
-          </w:p>
-        </w:tc>
-      </w:tr>
-      <w:tr>
-        <w:trPr>
-          <w:tblHeader w:val="false"/>
-        </w:trPr>
-        <w:tc>
-          <w:tcPr>
-            <w:tcW w:type="dxa" w:w="3400"/>
-            <w:tcMar>
-              <w:top w:type="dxa" w:w="60"/>
-              <w:left w:type="dxa" w:w="100"/>
-              <w:bottom w:type="dxa" w:w="60"/>
-              <w:right w:type="dxa" w:w="100"/>
-            </w:tcMar>
-          </w:tcPr>
-          <w:p>
-            <w:pPr>
-              <w:spacing w:after="0" w:line="240"/>
-              <w:jc w:val="left"/>
-            </w:pPr>
-            <w:r>
-              <w:rPr>
-                <w:rFonts w:ascii="Calibri" w:cs="Calibri" w:eastAsia="Calibri" w:hAnsi="Calibri"/>
-                <w:b w:val="false"/>
-                <w:bCs w:val="false"/>
-                <w:color w:val="000000"/>
-                <w:sz w:val="19"/>
-                <w:szCs w:val="19"/>
-              </w:rPr>
               <w:t xml:space="preserve">Wanessa Kylie Silva Medeiros</w:t>
-            </w:r>
-          </w:p>
-        </w:tc>
-        <w:tc>
-          <w:tcPr>
-            <w:tcW w:type="dxa" w:w="1500"/>
-            <w:tcMar>
-              <w:top w:type="dxa" w:w="60"/>
-              <w:left w:type="dxa" w:w="100"/>
-              <w:bottom w:type="dxa" w:w="60"/>
-              <w:right w:type="dxa" w:w="100"/>
-            </w:tcMar>
-          </w:tcPr>
-          <w:p>
-            <w:pPr>
-              <w:spacing w:after="0" w:line="240"/>
-              <w:jc w:val="left"/>
-            </w:pPr>
-            <w:r>
-              <w:rPr>
-                <w:rFonts w:ascii="Calibri" w:cs="Calibri" w:eastAsia="Calibri" w:hAnsi="Calibri"/>
-                <w:b w:val="false"/>
-                <w:bCs w:val="false"/>
-                <w:color w:val="000000"/>
-                <w:sz w:val="19"/>
-                <w:szCs w:val="19"/>
-              </w:rPr>
-              <w:t xml:space="preserve"/>
-            </w:r>
-          </w:p>
-        </w:tc>
-        <w:tc>
-          <w:tcPr>
-            <w:tcW w:type="dxa" w:w="4460"/>
-            <w:tcMar>
-              <w:top w:type="dxa" w:w="60"/>
-              <w:left w:type="dxa" w:w="100"/>
-              <w:bottom w:type="dxa" w:w="60"/>
-              <w:right w:type="dxa" w:w="100"/>
-            </w:tcMar>
-          </w:tcPr>
-          <w:p>
-            <w:pPr>
-              <w:spacing w:after="0" w:line="240"/>
-              <w:jc w:val="left"/>
-            </w:pPr>
-            <w:r>
-              <w:rPr>
-                <w:rFonts w:ascii="Calibri" w:cs="Calibri" w:eastAsia="Calibri" w:hAnsi="Calibri"/>
-                <w:b w:val="false"/>
-                <w:bCs w:val="false"/>
-                <w:color w:val="000000"/>
-                <w:sz w:val="19"/>
-                <w:szCs w:val="19"/>
-              </w:rPr>
-              <w:t xml:space="preserve"/>
             </w:r>
           </w:p>
         </w:tc>

</xml_diff>